<commit_message>
docs(HCO v2): complete IPC chapter rewrite (IPC.7-8), fix fabricated CDC citations in IPC.5 - 8/8 standards done
</commit_message>
<xml_diff>
--- a/policies/build/rewrite_reference/HCO_IPC_5_v2_REWRITE_DRAFT.docx
+++ b/policies/build/rewrite_reference/HCO_IPC_5_v2_REWRITE_DRAFT.docx
@@ -1699,31 +1699,7 @@
         <w:pStyle w:val="ListNumber"/>
       </w:pPr>
       <w:r>
-        <w:t>CDC Guidelines for Prevention of Catheter-Associated Urinary Tract Infections.</w:t>
-      </w:r>
-    </w:p>
-    <w:p>
-      <w:pPr>
-        <w:pStyle w:val="ListNumber"/>
-      </w:pPr>
-      <w:r>
-        <w:t>CDC/HICPAC Guidelines for Prevention of Healthcare-Associated Pneumonia (VAP reference).</w:t>
-      </w:r>
-    </w:p>
-    <w:p>
-      <w:pPr>
-        <w:pStyle w:val="ListNumber"/>
-      </w:pPr>
-      <w:r>
-        <w:t>CDC Guidelines for the Prevention of Intravascular Catheter-Related Infections (CLABSI reference).</w:t>
-      </w:r>
-    </w:p>
-    <w:p>
-      <w:pPr>
-        <w:pStyle w:val="ListNumber"/>
-      </w:pPr>
-      <w:r>
-        <w:t>CDC Guidelines for the Prevention of Surgical Site Infection.</w:t>
+        <w:t>CDC/WHO/SHEA guidelines for prevention of healthcare-associated infections (referenced for the CAUTI, VAP, CLABSI and SSI bundles).</w:t>
       </w:r>
     </w:p>
     <w:p>

</xml_diff>